<commit_message>
June 10th Task & Resume
</commit_message>
<xml_diff>
--- a/Tharun_Goud_Bandharam.docx
+++ b/Tharun_Goud_Bandharam.docx
@@ -361,7 +361,7 @@
           </mc:Choice>
           <mc:Fallback>
             <w:pict>
-              <v:shape w14:anchorId="690AA75C" id="Graphic 1" o:spid="_x0000_s1026" style="position:absolute;margin-left:39.7pt;margin-top:15.6pt;width:521.6pt;height:.1pt;z-index:-15728640;visibility:visible;mso-wrap-style:square;mso-wrap-distance-left:0;mso-wrap-distance-top:0;mso-wrap-distance-right:0;mso-wrap-distance-bottom:0;mso-position-horizontal:absolute;mso-position-horizontal-relative:page;mso-position-vertical:absolute;mso-position-vertical-relative:text;v-text-anchor:top" coordsize="6624320,1270" o:gfxdata="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" path="m,l6624002,e" filled="f" strokeweight=".14039mm">
+              <v:shape w14:anchorId="2749FCE3" id="Graphic 1" o:spid="_x0000_s1026" style="position:absolute;margin-left:39.7pt;margin-top:15.6pt;width:521.6pt;height:.1pt;z-index:-15728640;visibility:visible;mso-wrap-style:square;mso-wrap-distance-left:0;mso-wrap-distance-top:0;mso-wrap-distance-right:0;mso-wrap-distance-bottom:0;mso-position-horizontal:absolute;mso-position-horizontal-relative:page;mso-position-vertical:absolute;mso-position-vertical-relative:text;v-text-anchor:top" coordsize="6624320,1270" o:gfxdata="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" path="m,l6624002,e" filled="f" strokeweight=".14039mm">
                 <v:path arrowok="t"/>
                 <w10:wrap type="topAndBottom" anchorx="page"/>
               </v:shape>
@@ -2093,14 +2093,13 @@
         </w:rPr>
         <w:t xml:space="preserve"> </w:t>
       </w:r>
-      <w:proofErr w:type="spellStart"/>
-      <w:r>
-        <w:rPr>
-          <w:rFonts w:asciiTheme="minorHAnsi" w:hAnsiTheme="minorHAnsi" w:cstheme="minorHAnsi"/>
-          <w:w w:val="110"/>
-          <w:sz w:val="20"/>
-        </w:rPr>
-        <w:t>sta-</w:t>
+      <w:r>
+        <w:rPr>
+          <w:rFonts w:asciiTheme="minorHAnsi" w:hAnsiTheme="minorHAnsi" w:cstheme="minorHAnsi"/>
+          <w:w w:val="110"/>
+          <w:sz w:val="20"/>
+        </w:rPr>
+        <w:t>sta</w:t>
       </w:r>
       <w:r>
         <w:rPr>
@@ -2111,7 +2110,6 @@
         </w:rPr>
         <w:t>bility</w:t>
       </w:r>
-      <w:proofErr w:type="spellEnd"/>
     </w:p>
     <w:p>
       <w:pPr>
@@ -3344,7 +3342,7 @@
           </mc:Choice>
           <mc:Fallback>
             <w:pict>
-              <v:shape w14:anchorId="1FFCE207" id="Graphic 2" o:spid="_x0000_s1026" style="position:absolute;margin-left:39.7pt;margin-top:15.8pt;width:521.6pt;height:.1pt;z-index:-15728128;visibility:visible;mso-wrap-style:square;mso-wrap-distance-left:0;mso-wrap-distance-top:0;mso-wrap-distance-right:0;mso-wrap-distance-bottom:0;mso-position-horizontal:absolute;mso-position-horizontal-relative:page;mso-position-vertical:absolute;mso-position-vertical-relative:text;v-text-anchor:top" coordsize="6624320,1270" o:gfxdata="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" path="m,l6624002,e" filled="f" strokeweight=".14039mm">
+              <v:shape w14:anchorId="5E266505" id="Graphic 2" o:spid="_x0000_s1026" style="position:absolute;margin-left:39.7pt;margin-top:15.8pt;width:521.6pt;height:.1pt;z-index:-15728128;visibility:visible;mso-wrap-style:square;mso-wrap-distance-left:0;mso-wrap-distance-top:0;mso-wrap-distance-right:0;mso-wrap-distance-bottom:0;mso-position-horizontal:absolute;mso-position-horizontal-relative:page;mso-position-vertical:absolute;mso-position-vertical-relative:text;v-text-anchor:top" coordsize="6624320,1270" o:gfxdata="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" path="m,l6624002,e" filled="f" strokeweight=".14039mm">
                 <v:path arrowok="t"/>
                 <w10:wrap type="topAndBottom" anchorx="page"/>
               </v:shape>
@@ -3376,149 +3374,14 @@
     </w:p>
     <w:p>
       <w:pPr>
-        <w:pStyle w:val="ListParagraph"/>
-        <w:numPr>
-          <w:ilvl w:val="0"/>
-          <w:numId w:val="1"/>
-        </w:numPr>
         <w:tabs>
           <w:tab w:val="left" w:pos="366"/>
         </w:tabs>
-        <w:spacing w:before="26"/>
-        <w:ind w:left="366" w:hanging="167"/>
-        <w:rPr>
-          <w:rFonts w:asciiTheme="minorHAnsi" w:hAnsiTheme="minorHAnsi" w:cstheme="minorHAnsi"/>
-          <w:sz w:val="20"/>
-        </w:rPr>
-      </w:pPr>
-      <w:r>
-        <w:rPr>
-          <w:rFonts w:asciiTheme="minorHAnsi" w:hAnsiTheme="minorHAnsi" w:cstheme="minorHAnsi"/>
-          <w:w w:val="105"/>
-          <w:sz w:val="20"/>
-        </w:rPr>
-        <w:t>Python</w:t>
-      </w:r>
-      <w:r>
-        <w:rPr>
-          <w:rFonts w:asciiTheme="minorHAnsi" w:hAnsiTheme="minorHAnsi" w:cstheme="minorHAnsi"/>
-          <w:spacing w:val="16"/>
-          <w:w w:val="105"/>
-          <w:sz w:val="20"/>
-        </w:rPr>
-        <w:t xml:space="preserve"> </w:t>
-      </w:r>
-      <w:r>
-        <w:rPr>
-          <w:rFonts w:asciiTheme="minorHAnsi" w:hAnsiTheme="minorHAnsi" w:cstheme="minorHAnsi"/>
-          <w:w w:val="105"/>
-          <w:sz w:val="20"/>
-        </w:rPr>
-        <w:t>and</w:t>
-      </w:r>
-      <w:r>
-        <w:rPr>
-          <w:rFonts w:asciiTheme="minorHAnsi" w:hAnsiTheme="minorHAnsi" w:cstheme="minorHAnsi"/>
-          <w:spacing w:val="16"/>
-          <w:w w:val="105"/>
-          <w:sz w:val="20"/>
-        </w:rPr>
-        <w:t xml:space="preserve"> </w:t>
-      </w:r>
-      <w:r>
-        <w:rPr>
-          <w:rFonts w:asciiTheme="minorHAnsi" w:hAnsiTheme="minorHAnsi" w:cstheme="minorHAnsi"/>
-          <w:w w:val="105"/>
-          <w:sz w:val="20"/>
-        </w:rPr>
-        <w:t>Django</w:t>
-      </w:r>
-      <w:r>
-        <w:rPr>
-          <w:rFonts w:asciiTheme="minorHAnsi" w:hAnsiTheme="minorHAnsi" w:cstheme="minorHAnsi"/>
-          <w:spacing w:val="17"/>
-          <w:w w:val="105"/>
-          <w:sz w:val="20"/>
-        </w:rPr>
-        <w:t xml:space="preserve"> </w:t>
-      </w:r>
-      <w:r>
-        <w:rPr>
-          <w:rFonts w:asciiTheme="minorHAnsi" w:hAnsiTheme="minorHAnsi" w:cstheme="minorHAnsi"/>
-          <w:w w:val="105"/>
-          <w:sz w:val="20"/>
-        </w:rPr>
-        <w:t>Framework</w:t>
-      </w:r>
-      <w:r>
-        <w:rPr>
-          <w:rFonts w:asciiTheme="minorHAnsi" w:hAnsiTheme="minorHAnsi" w:cstheme="minorHAnsi"/>
-          <w:spacing w:val="16"/>
-          <w:w w:val="105"/>
-          <w:sz w:val="20"/>
-        </w:rPr>
-        <w:t xml:space="preserve"> </w:t>
-      </w:r>
-      <w:r>
-        <w:rPr>
-          <w:rFonts w:asciiTheme="minorHAnsi" w:hAnsiTheme="minorHAnsi" w:cstheme="minorHAnsi"/>
-          <w:w w:val="105"/>
-          <w:sz w:val="20"/>
-        </w:rPr>
-        <w:t>for</w:t>
-      </w:r>
-      <w:r>
-        <w:rPr>
-          <w:rFonts w:asciiTheme="minorHAnsi" w:hAnsiTheme="minorHAnsi" w:cstheme="minorHAnsi"/>
-          <w:spacing w:val="17"/>
-          <w:w w:val="105"/>
-          <w:sz w:val="20"/>
-        </w:rPr>
-        <w:t xml:space="preserve"> </w:t>
-      </w:r>
-      <w:r>
-        <w:rPr>
-          <w:rFonts w:asciiTheme="minorHAnsi" w:hAnsiTheme="minorHAnsi" w:cstheme="minorHAnsi"/>
-          <w:w w:val="105"/>
-          <w:sz w:val="20"/>
-        </w:rPr>
-        <w:t>Beginners</w:t>
-      </w:r>
-      <w:r>
-        <w:rPr>
-          <w:rFonts w:asciiTheme="minorHAnsi" w:hAnsiTheme="minorHAnsi" w:cstheme="minorHAnsi"/>
-          <w:spacing w:val="16"/>
-          <w:w w:val="105"/>
-          <w:sz w:val="20"/>
-        </w:rPr>
-        <w:t xml:space="preserve"> </w:t>
-      </w:r>
-      <w:r>
-        <w:rPr>
-          <w:rFonts w:asciiTheme="minorHAnsi" w:hAnsiTheme="minorHAnsi" w:cstheme="minorHAnsi"/>
-          <w:w w:val="105"/>
-          <w:sz w:val="20"/>
-        </w:rPr>
-        <w:t>-</w:t>
-      </w:r>
-      <w:r>
-        <w:rPr>
-          <w:rFonts w:asciiTheme="minorHAnsi" w:hAnsiTheme="minorHAnsi" w:cstheme="minorHAnsi"/>
-          <w:spacing w:val="17"/>
-          <w:w w:val="105"/>
-          <w:sz w:val="20"/>
-        </w:rPr>
-        <w:t xml:space="preserve"> </w:t>
-      </w:r>
-      <w:r>
-        <w:rPr>
-          <w:rFonts w:asciiTheme="minorHAnsi" w:hAnsiTheme="minorHAnsi" w:cstheme="minorHAnsi"/>
-          <w:spacing w:val="-2"/>
-          <w:w w:val="105"/>
-          <w:sz w:val="20"/>
-        </w:rPr>
-        <w:t>Udemy</w:t>
-      </w:r>
+        <w:rPr>
+          <w:rFonts w:asciiTheme="minorHAnsi" w:hAnsiTheme="minorHAnsi" w:cstheme="minorHAnsi"/>
+          <w:sz w:val="20"/>
+        </w:rPr>
+      </w:pPr>
     </w:p>
     <w:p>
       <w:pPr>
@@ -3539,297 +3402,9 @@
       <w:r>
         <w:rPr>
           <w:rFonts w:asciiTheme="minorHAnsi" w:hAnsiTheme="minorHAnsi" w:cstheme="minorHAnsi"/>
-          <w:w w:val="105"/>
-          <w:sz w:val="20"/>
-        </w:rPr>
-        <w:t>Generative</w:t>
-      </w:r>
-      <w:r>
-        <w:rPr>
-          <w:rFonts w:asciiTheme="minorHAnsi" w:hAnsiTheme="minorHAnsi" w:cstheme="minorHAnsi"/>
-          <w:spacing w:val="16"/>
-          <w:w w:val="105"/>
-          <w:sz w:val="20"/>
-        </w:rPr>
-        <w:t xml:space="preserve"> </w:t>
-      </w:r>
-      <w:r>
-        <w:rPr>
-          <w:rFonts w:asciiTheme="minorHAnsi" w:hAnsiTheme="minorHAnsi" w:cstheme="minorHAnsi"/>
-          <w:w w:val="105"/>
-          <w:sz w:val="20"/>
-        </w:rPr>
-        <w:t>AI</w:t>
-      </w:r>
-      <w:r>
-        <w:rPr>
-          <w:rFonts w:asciiTheme="minorHAnsi" w:hAnsiTheme="minorHAnsi" w:cstheme="minorHAnsi"/>
-          <w:spacing w:val="17"/>
-          <w:w w:val="105"/>
-          <w:sz w:val="20"/>
-        </w:rPr>
-        <w:t xml:space="preserve"> </w:t>
-      </w:r>
-      <w:r>
-        <w:rPr>
-          <w:rFonts w:asciiTheme="minorHAnsi" w:hAnsiTheme="minorHAnsi" w:cstheme="minorHAnsi"/>
-          <w:w w:val="105"/>
-          <w:sz w:val="20"/>
-        </w:rPr>
-        <w:t>Prompt</w:t>
-      </w:r>
-      <w:r>
-        <w:rPr>
-          <w:rFonts w:asciiTheme="minorHAnsi" w:hAnsiTheme="minorHAnsi" w:cstheme="minorHAnsi"/>
-          <w:spacing w:val="17"/>
-          <w:w w:val="105"/>
-          <w:sz w:val="20"/>
-        </w:rPr>
-        <w:t xml:space="preserve"> </w:t>
-      </w:r>
-      <w:r>
-        <w:rPr>
-          <w:rFonts w:asciiTheme="minorHAnsi" w:hAnsiTheme="minorHAnsi" w:cstheme="minorHAnsi"/>
-          <w:w w:val="105"/>
-          <w:sz w:val="20"/>
-        </w:rPr>
-        <w:t>Engineering</w:t>
-      </w:r>
-      <w:r>
-        <w:rPr>
-          <w:rFonts w:asciiTheme="minorHAnsi" w:hAnsiTheme="minorHAnsi" w:cstheme="minorHAnsi"/>
-          <w:spacing w:val="17"/>
-          <w:w w:val="105"/>
-          <w:sz w:val="20"/>
-        </w:rPr>
-        <w:t xml:space="preserve"> </w:t>
-      </w:r>
-      <w:r>
-        <w:rPr>
-          <w:rFonts w:asciiTheme="minorHAnsi" w:hAnsiTheme="minorHAnsi" w:cstheme="minorHAnsi"/>
-          <w:w w:val="105"/>
-          <w:sz w:val="20"/>
-        </w:rPr>
-        <w:t>Basics</w:t>
-      </w:r>
-      <w:r>
-        <w:rPr>
-          <w:rFonts w:asciiTheme="minorHAnsi" w:hAnsiTheme="minorHAnsi" w:cstheme="minorHAnsi"/>
-          <w:spacing w:val="17"/>
-          <w:w w:val="105"/>
-          <w:sz w:val="20"/>
-        </w:rPr>
-        <w:t xml:space="preserve"> </w:t>
-      </w:r>
-      <w:r>
-        <w:rPr>
-          <w:rFonts w:asciiTheme="minorHAnsi" w:hAnsiTheme="minorHAnsi" w:cstheme="minorHAnsi"/>
-          <w:w w:val="105"/>
-          <w:sz w:val="20"/>
-        </w:rPr>
-        <w:t>-</w:t>
-      </w:r>
-      <w:r>
-        <w:rPr>
-          <w:rFonts w:asciiTheme="minorHAnsi" w:hAnsiTheme="minorHAnsi" w:cstheme="minorHAnsi"/>
-          <w:spacing w:val="17"/>
-          <w:w w:val="105"/>
-          <w:sz w:val="20"/>
-        </w:rPr>
-        <w:t xml:space="preserve"> </w:t>
-      </w:r>
-      <w:r>
-        <w:rPr>
-          <w:rFonts w:asciiTheme="minorHAnsi" w:hAnsiTheme="minorHAnsi" w:cstheme="minorHAnsi"/>
-          <w:w w:val="105"/>
-          <w:sz w:val="20"/>
-        </w:rPr>
-        <w:t>IBM</w:t>
-      </w:r>
-      <w:r>
-        <w:rPr>
-          <w:rFonts w:asciiTheme="minorHAnsi" w:hAnsiTheme="minorHAnsi" w:cstheme="minorHAnsi"/>
-          <w:spacing w:val="17"/>
-          <w:w w:val="105"/>
-          <w:sz w:val="20"/>
-        </w:rPr>
-        <w:t xml:space="preserve"> </w:t>
-      </w:r>
-      <w:r>
-        <w:rPr>
-          <w:rFonts w:asciiTheme="minorHAnsi" w:hAnsiTheme="minorHAnsi" w:cstheme="minorHAnsi"/>
-          <w:spacing w:val="-2"/>
-          <w:w w:val="105"/>
-          <w:sz w:val="20"/>
-        </w:rPr>
-        <w:t>(Coursera)</w:t>
-      </w:r>
-    </w:p>
-    <w:p>
-      <w:pPr>
-        <w:pStyle w:val="BodyText"/>
-        <w:spacing w:before="33"/>
-        <w:ind w:left="0" w:firstLine="0"/>
-        <w:rPr>
-          <w:rFonts w:asciiTheme="minorHAnsi" w:hAnsiTheme="minorHAnsi" w:cstheme="minorHAnsi"/>
-        </w:rPr>
-      </w:pPr>
-    </w:p>
-    <w:p>
-      <w:pPr>
-        <w:pStyle w:val="Heading2"/>
-        <w:rPr>
-          <w:rFonts w:asciiTheme="minorHAnsi" w:hAnsiTheme="minorHAnsi" w:cstheme="minorHAnsi"/>
-          <w:u w:val="none"/>
-        </w:rPr>
-      </w:pPr>
-      <w:r>
-        <w:rPr>
-          <w:rFonts w:asciiTheme="minorHAnsi" w:hAnsiTheme="minorHAnsi" w:cstheme="minorHAnsi"/>
-          <w:noProof/>
-        </w:rPr>
-        <mc:AlternateContent>
-          <mc:Choice Requires="wps">
-            <w:drawing>
-              <wp:anchor distT="0" distB="0" distL="0" distR="0" simplePos="0" relativeHeight="487588864" behindDoc="1" locked="0" layoutInCell="1" allowOverlap="1" wp14:anchorId="66201366" wp14:editId="779512CF">
-                <wp:simplePos x="0" y="0"/>
-                <wp:positionH relativeFrom="page">
-                  <wp:posOffset>503999</wp:posOffset>
-                </wp:positionH>
-                <wp:positionV relativeFrom="paragraph">
-                  <wp:posOffset>200724</wp:posOffset>
-                </wp:positionV>
-                <wp:extent cx="6624320" cy="1270"/>
-                <wp:effectExtent l="0" t="0" r="0" b="0"/>
-                <wp:wrapTopAndBottom/>
-                <wp:docPr id="3" name="Graphic 3"/>
-                <wp:cNvGraphicFramePr>
-                  <a:graphicFrameLocks xmlns:a="http://schemas.openxmlformats.org/drawingml/2006/main"/>
-                </wp:cNvGraphicFramePr>
-                <a:graphic xmlns:a="http://schemas.openxmlformats.org/drawingml/2006/main">
-                  <a:graphicData uri="http://schemas.microsoft.com/office/word/2010/wordprocessingShape">
-                    <wps:wsp>
-                      <wps:cNvSpPr>
-                        <a:spLocks/>
-                      </wps:cNvSpPr>
-                      <wps:spPr>
-                        <a:xfrm>
-                          <a:off x="0" y="0"/>
-                          <a:ext cx="6624320" cy="1270"/>
-                        </a:xfrm>
-                        <a:custGeom>
-                          <a:avLst/>
-                          <a:gdLst/>
-                          <a:ahLst/>
-                          <a:cxnLst/>
-                          <a:rect l="l" t="t" r="r" b="b"/>
-                          <a:pathLst>
-                            <a:path w="6624320">
-                              <a:moveTo>
-                                <a:pt x="0" y="0"/>
-                              </a:moveTo>
-                              <a:lnTo>
-                                <a:pt x="6624002" y="0"/>
-                              </a:lnTo>
-                            </a:path>
-                          </a:pathLst>
-                        </a:custGeom>
-                        <a:ln w="5054">
-                          <a:solidFill>
-                            <a:srgbClr val="000000"/>
-                          </a:solidFill>
-                          <a:prstDash val="solid"/>
-                        </a:ln>
-                      </wps:spPr>
-                      <wps:bodyPr wrap="square" lIns="0" tIns="0" rIns="0" bIns="0" rtlCol="0">
-                        <a:prstTxWarp prst="textNoShape">
-                          <a:avLst/>
-                        </a:prstTxWarp>
-                        <a:noAutofit/>
-                      </wps:bodyPr>
-                    </wps:wsp>
-                  </a:graphicData>
-                </a:graphic>
-              </wp:anchor>
-            </w:drawing>
-          </mc:Choice>
-          <mc:Fallback>
-            <w:pict>
-              <v:shape w14:anchorId="22FE39BB" id="Graphic 3" o:spid="_x0000_s1026" style="position:absolute;margin-left:39.7pt;margin-top:15.8pt;width:521.6pt;height:.1pt;z-index:-15727616;visibility:visible;mso-wrap-style:square;mso-wrap-distance-left:0;mso-wrap-distance-top:0;mso-wrap-distance-right:0;mso-wrap-distance-bottom:0;mso-position-horizontal:absolute;mso-position-horizontal-relative:page;mso-position-vertical:absolute;mso-position-vertical-relative:text;v-text-anchor:top" coordsize="6624320,1270" o:gfxdata="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" path="m,l6624002,e" filled="f" strokeweight=".14039mm">
-                <v:path arrowok="t"/>
-                <w10:wrap type="topAndBottom" anchorx="page"/>
-              </v:shape>
-            </w:pict>
-          </mc:Fallback>
-        </mc:AlternateContent>
-      </w:r>
-      <w:bookmarkStart w:id="5" w:name="Achievements"/>
-      <w:bookmarkEnd w:id="5"/>
-      <w:r>
-        <w:rPr>
-          <w:rFonts w:asciiTheme="minorHAnsi" w:hAnsiTheme="minorHAnsi" w:cstheme="minorHAnsi"/>
-          <w:spacing w:val="-2"/>
-          <w:w w:val="125"/>
-          <w:u w:val="none"/>
-        </w:rPr>
-        <w:t>ACH</w:t>
-      </w:r>
-      <w:r>
-        <w:rPr>
-          <w:rFonts w:asciiTheme="minorHAnsi" w:hAnsiTheme="minorHAnsi" w:cstheme="minorHAnsi"/>
-          <w:smallCaps/>
-          <w:spacing w:val="-2"/>
-          <w:w w:val="125"/>
-          <w:u w:val="none"/>
-        </w:rPr>
-        <w:t>IE</w:t>
-      </w:r>
-      <w:r>
-        <w:rPr>
-          <w:rFonts w:asciiTheme="minorHAnsi" w:hAnsiTheme="minorHAnsi" w:cstheme="minorHAnsi"/>
-          <w:spacing w:val="-2"/>
-          <w:w w:val="125"/>
-          <w:u w:val="none"/>
-        </w:rPr>
-        <w:t>V</w:t>
-      </w:r>
-      <w:r>
-        <w:rPr>
-          <w:rFonts w:asciiTheme="minorHAnsi" w:hAnsiTheme="minorHAnsi" w:cstheme="minorHAnsi"/>
-          <w:smallCaps/>
-          <w:spacing w:val="-2"/>
-          <w:w w:val="125"/>
-          <w:u w:val="none"/>
-        </w:rPr>
-        <w:t>EME</w:t>
-      </w:r>
-      <w:r>
-        <w:rPr>
-          <w:rFonts w:asciiTheme="minorHAnsi" w:hAnsiTheme="minorHAnsi" w:cstheme="minorHAnsi"/>
-          <w:spacing w:val="-2"/>
-          <w:w w:val="125"/>
-          <w:u w:val="none"/>
-        </w:rPr>
-        <w:t>N</w:t>
-      </w:r>
-      <w:r>
-        <w:rPr>
-          <w:rFonts w:asciiTheme="minorHAnsi" w:hAnsiTheme="minorHAnsi" w:cstheme="minorHAnsi"/>
-          <w:smallCaps/>
-          <w:spacing w:val="-2"/>
-          <w:w w:val="125"/>
-          <w:u w:val="none"/>
-        </w:rPr>
-        <w:t>T</w:t>
-      </w:r>
-      <w:r>
-        <w:rPr>
-          <w:rFonts w:asciiTheme="minorHAnsi" w:hAnsiTheme="minorHAnsi" w:cstheme="minorHAnsi"/>
-          <w:spacing w:val="-2"/>
-          <w:w w:val="125"/>
-          <w:u w:val="none"/>
-        </w:rPr>
-        <w:t>S</w:t>
+          <w:sz w:val="20"/>
+        </w:rPr>
+        <w:t>CCNAv7: Introduction to Networks (2024)</w:t>
       </w:r>
     </w:p>
     <w:p>
@@ -3842,7 +3417,6 @@
         <w:tabs>
           <w:tab w:val="left" w:pos="366"/>
         </w:tabs>
-        <w:spacing w:before="38"/>
         <w:ind w:left="366" w:hanging="167"/>
         <w:rPr>
           <w:rFonts w:asciiTheme="minorHAnsi" w:hAnsiTheme="minorHAnsi" w:cstheme="minorHAnsi"/>
@@ -3852,202 +3426,178 @@
       <w:r>
         <w:rPr>
           <w:rFonts w:asciiTheme="minorHAnsi" w:hAnsiTheme="minorHAnsi" w:cstheme="minorHAnsi"/>
-          <w:w w:val="105"/>
-          <w:sz w:val="20"/>
-        </w:rPr>
-        <w:t>Co-authored</w:t>
-      </w:r>
-      <w:r>
-        <w:rPr>
-          <w:rFonts w:asciiTheme="minorHAnsi" w:hAnsiTheme="minorHAnsi" w:cstheme="minorHAnsi"/>
-          <w:spacing w:val="25"/>
-          <w:w w:val="105"/>
-          <w:sz w:val="20"/>
-        </w:rPr>
-        <w:t xml:space="preserve"> </w:t>
-      </w:r>
-      <w:r>
-        <w:rPr>
-          <w:rFonts w:asciiTheme="minorHAnsi" w:hAnsiTheme="minorHAnsi" w:cstheme="minorHAnsi"/>
-          <w:w w:val="105"/>
-          <w:sz w:val="20"/>
-        </w:rPr>
-        <w:t>research</w:t>
-      </w:r>
-      <w:r>
-        <w:rPr>
-          <w:rFonts w:asciiTheme="minorHAnsi" w:hAnsiTheme="minorHAnsi" w:cstheme="minorHAnsi"/>
-          <w:spacing w:val="26"/>
-          <w:w w:val="105"/>
-          <w:sz w:val="20"/>
-        </w:rPr>
-        <w:t xml:space="preserve"> </w:t>
-      </w:r>
-      <w:r>
-        <w:rPr>
-          <w:rFonts w:asciiTheme="minorHAnsi" w:hAnsiTheme="minorHAnsi" w:cstheme="minorHAnsi"/>
-          <w:w w:val="105"/>
-          <w:sz w:val="20"/>
-        </w:rPr>
-        <w:t>publication</w:t>
-      </w:r>
-      <w:r>
-        <w:rPr>
-          <w:rFonts w:asciiTheme="minorHAnsi" w:hAnsiTheme="minorHAnsi" w:cstheme="minorHAnsi"/>
-          <w:spacing w:val="25"/>
-          <w:w w:val="105"/>
-          <w:sz w:val="20"/>
-        </w:rPr>
-        <w:t xml:space="preserve"> </w:t>
-      </w:r>
-      <w:r>
-        <w:rPr>
-          <w:rFonts w:asciiTheme="minorHAnsi" w:hAnsiTheme="minorHAnsi" w:cstheme="minorHAnsi"/>
-          <w:w w:val="105"/>
-          <w:sz w:val="20"/>
-        </w:rPr>
-        <w:t>in</w:t>
-      </w:r>
-      <w:r>
-        <w:rPr>
-          <w:rFonts w:asciiTheme="minorHAnsi" w:hAnsiTheme="minorHAnsi" w:cstheme="minorHAnsi"/>
-          <w:spacing w:val="26"/>
-          <w:w w:val="105"/>
-          <w:sz w:val="20"/>
-        </w:rPr>
-        <w:t xml:space="preserve"> </w:t>
-      </w:r>
-      <w:r>
-        <w:rPr>
-          <w:rFonts w:asciiTheme="minorHAnsi" w:hAnsiTheme="minorHAnsi" w:cstheme="minorHAnsi"/>
-          <w:w w:val="105"/>
-          <w:sz w:val="20"/>
-        </w:rPr>
-        <w:t>WJARR</w:t>
-      </w:r>
-      <w:r>
-        <w:rPr>
-          <w:rFonts w:asciiTheme="minorHAnsi" w:hAnsiTheme="minorHAnsi" w:cstheme="minorHAnsi"/>
-          <w:spacing w:val="26"/>
-          <w:w w:val="105"/>
-          <w:sz w:val="20"/>
-        </w:rPr>
-        <w:t xml:space="preserve"> </w:t>
-      </w:r>
-      <w:r>
-        <w:rPr>
-          <w:rFonts w:asciiTheme="minorHAnsi" w:hAnsiTheme="minorHAnsi" w:cstheme="minorHAnsi"/>
-          <w:w w:val="105"/>
-          <w:sz w:val="20"/>
-        </w:rPr>
-        <w:t>on</w:t>
-      </w:r>
-      <w:r>
-        <w:rPr>
-          <w:rFonts w:asciiTheme="minorHAnsi" w:hAnsiTheme="minorHAnsi" w:cstheme="minorHAnsi"/>
-          <w:spacing w:val="25"/>
-          <w:w w:val="105"/>
-          <w:sz w:val="20"/>
-        </w:rPr>
-        <w:t xml:space="preserve"> </w:t>
-      </w:r>
-      <w:proofErr w:type="spellStart"/>
-      <w:r>
-        <w:rPr>
-          <w:rFonts w:asciiTheme="minorHAnsi" w:hAnsiTheme="minorHAnsi" w:cstheme="minorHAnsi"/>
-          <w:w w:val="105"/>
-          <w:sz w:val="20"/>
-        </w:rPr>
-        <w:t>EduQuest</w:t>
-      </w:r>
-      <w:proofErr w:type="spellEnd"/>
-      <w:r>
-        <w:rPr>
-          <w:rFonts w:asciiTheme="minorHAnsi" w:hAnsiTheme="minorHAnsi" w:cstheme="minorHAnsi"/>
-          <w:spacing w:val="26"/>
-          <w:w w:val="105"/>
-          <w:sz w:val="20"/>
-        </w:rPr>
-        <w:t xml:space="preserve"> </w:t>
-      </w:r>
-      <w:r>
-        <w:rPr>
-          <w:rFonts w:asciiTheme="minorHAnsi" w:hAnsiTheme="minorHAnsi" w:cstheme="minorHAnsi"/>
-          <w:w w:val="105"/>
-          <w:sz w:val="20"/>
-        </w:rPr>
-        <w:t>and</w:t>
-      </w:r>
-      <w:r>
-        <w:rPr>
-          <w:rFonts w:asciiTheme="minorHAnsi" w:hAnsiTheme="minorHAnsi" w:cstheme="minorHAnsi"/>
-          <w:spacing w:val="25"/>
-          <w:w w:val="105"/>
-          <w:sz w:val="20"/>
-        </w:rPr>
-        <w:t xml:space="preserve"> </w:t>
-      </w:r>
-      <w:proofErr w:type="spellStart"/>
-      <w:r>
-        <w:rPr>
-          <w:rFonts w:asciiTheme="minorHAnsi" w:hAnsiTheme="minorHAnsi" w:cstheme="minorHAnsi"/>
-          <w:w w:val="105"/>
-          <w:sz w:val="20"/>
-        </w:rPr>
-        <w:t>SympTrack</w:t>
-      </w:r>
-      <w:proofErr w:type="spellEnd"/>
-      <w:r>
-        <w:rPr>
-          <w:rFonts w:asciiTheme="minorHAnsi" w:hAnsiTheme="minorHAnsi" w:cstheme="minorHAnsi"/>
-          <w:spacing w:val="26"/>
-          <w:w w:val="105"/>
-          <w:sz w:val="20"/>
-        </w:rPr>
-        <w:t xml:space="preserve"> </w:t>
-      </w:r>
-      <w:r>
-        <w:rPr>
-          <w:rFonts w:asciiTheme="minorHAnsi" w:hAnsiTheme="minorHAnsi" w:cstheme="minorHAnsi"/>
-          <w:w w:val="105"/>
-          <w:sz w:val="20"/>
-        </w:rPr>
-        <w:t>systems</w:t>
-      </w:r>
-      <w:r>
-        <w:rPr>
-          <w:rFonts w:asciiTheme="minorHAnsi" w:hAnsiTheme="minorHAnsi" w:cstheme="minorHAnsi"/>
-          <w:spacing w:val="26"/>
-          <w:w w:val="105"/>
-          <w:sz w:val="20"/>
-        </w:rPr>
-        <w:t xml:space="preserve"> </w:t>
-      </w:r>
-      <w:r>
-        <w:rPr>
-          <w:rFonts w:asciiTheme="minorHAnsi" w:hAnsiTheme="minorHAnsi" w:cstheme="minorHAnsi"/>
-          <w:w w:val="105"/>
-          <w:sz w:val="20"/>
-        </w:rPr>
-        <w:t>(Feb</w:t>
-      </w:r>
-      <w:r>
-        <w:rPr>
-          <w:rFonts w:asciiTheme="minorHAnsi" w:hAnsiTheme="minorHAnsi" w:cstheme="minorHAnsi"/>
-          <w:spacing w:val="25"/>
-          <w:w w:val="105"/>
-          <w:sz w:val="20"/>
-        </w:rPr>
-        <w:t xml:space="preserve"> </w:t>
-      </w:r>
-      <w:r>
-        <w:rPr>
-          <w:rFonts w:asciiTheme="minorHAnsi" w:hAnsiTheme="minorHAnsi" w:cstheme="minorHAnsi"/>
-          <w:spacing w:val="-2"/>
-          <w:w w:val="105"/>
-          <w:sz w:val="20"/>
-        </w:rPr>
-        <w:t>2025)</w:t>
+          <w:sz w:val="20"/>
+        </w:rPr>
+        <w:t>CCNAv7: Switching, Routing and Wireless Essentials (2024)</w:t>
+      </w:r>
+    </w:p>
+    <w:p>
+      <w:pPr>
+        <w:pStyle w:val="ListParagraph"/>
+        <w:numPr>
+          <w:ilvl w:val="0"/>
+          <w:numId w:val="1"/>
+        </w:numPr>
+        <w:tabs>
+          <w:tab w:val="left" w:pos="366"/>
+        </w:tabs>
+        <w:ind w:left="366" w:hanging="167"/>
+        <w:rPr>
+          <w:rFonts w:asciiTheme="minorHAnsi" w:hAnsiTheme="minorHAnsi" w:cstheme="minorHAnsi"/>
+          <w:sz w:val="20"/>
+        </w:rPr>
+      </w:pPr>
+      <w:r>
+        <w:rPr>
+          <w:rFonts w:asciiTheme="minorHAnsi" w:hAnsiTheme="minorHAnsi" w:cstheme="minorHAnsi"/>
+          <w:sz w:val="20"/>
+        </w:rPr>
+        <w:t>CCNAv7: Enterprise Networking, Security and Automation (2024)</w:t>
+      </w:r>
+    </w:p>
+    <w:p>
+      <w:pPr>
+        <w:pStyle w:val="ListParagraph"/>
+        <w:numPr>
+          <w:ilvl w:val="0"/>
+          <w:numId w:val="1"/>
+        </w:numPr>
+        <w:tabs>
+          <w:tab w:val="left" w:pos="366"/>
+        </w:tabs>
+        <w:ind w:left="366" w:hanging="167"/>
+        <w:rPr>
+          <w:rFonts w:asciiTheme="minorHAnsi" w:hAnsiTheme="minorHAnsi" w:cstheme="minorHAnsi"/>
+          <w:sz w:val="20"/>
+        </w:rPr>
+      </w:pPr>
+      <w:r>
+        <w:rPr>
+          <w:rFonts w:asciiTheme="minorHAnsi" w:hAnsiTheme="minorHAnsi" w:cstheme="minorHAnsi"/>
+          <w:w w:val="105"/>
+          <w:sz w:val="20"/>
+        </w:rPr>
+        <w:t>Generative</w:t>
+      </w:r>
+      <w:r>
+        <w:rPr>
+          <w:rFonts w:asciiTheme="minorHAnsi" w:hAnsiTheme="minorHAnsi" w:cstheme="minorHAnsi"/>
+          <w:spacing w:val="16"/>
+          <w:w w:val="105"/>
+          <w:sz w:val="20"/>
+        </w:rPr>
+        <w:t xml:space="preserve"> </w:t>
+      </w:r>
+      <w:r>
+        <w:rPr>
+          <w:rFonts w:asciiTheme="minorHAnsi" w:hAnsiTheme="minorHAnsi" w:cstheme="minorHAnsi"/>
+          <w:w w:val="105"/>
+          <w:sz w:val="20"/>
+        </w:rPr>
+        <w:t>AI</w:t>
+      </w:r>
+      <w:r>
+        <w:rPr>
+          <w:rFonts w:asciiTheme="minorHAnsi" w:hAnsiTheme="minorHAnsi" w:cstheme="minorHAnsi"/>
+          <w:spacing w:val="17"/>
+          <w:w w:val="105"/>
+          <w:sz w:val="20"/>
+        </w:rPr>
+        <w:t xml:space="preserve"> </w:t>
+      </w:r>
+      <w:r>
+        <w:rPr>
+          <w:rFonts w:asciiTheme="minorHAnsi" w:hAnsiTheme="minorHAnsi" w:cstheme="minorHAnsi"/>
+          <w:w w:val="105"/>
+          <w:sz w:val="20"/>
+        </w:rPr>
+        <w:t>Prompt</w:t>
+      </w:r>
+      <w:r>
+        <w:rPr>
+          <w:rFonts w:asciiTheme="minorHAnsi" w:hAnsiTheme="minorHAnsi" w:cstheme="minorHAnsi"/>
+          <w:spacing w:val="17"/>
+          <w:w w:val="105"/>
+          <w:sz w:val="20"/>
+        </w:rPr>
+        <w:t xml:space="preserve"> </w:t>
+      </w:r>
+      <w:r>
+        <w:rPr>
+          <w:rFonts w:asciiTheme="minorHAnsi" w:hAnsiTheme="minorHAnsi" w:cstheme="minorHAnsi"/>
+          <w:w w:val="105"/>
+          <w:sz w:val="20"/>
+        </w:rPr>
+        <w:t>Engineering</w:t>
+      </w:r>
+      <w:r>
+        <w:rPr>
+          <w:rFonts w:asciiTheme="minorHAnsi" w:hAnsiTheme="minorHAnsi" w:cstheme="minorHAnsi"/>
+          <w:spacing w:val="17"/>
+          <w:w w:val="105"/>
+          <w:sz w:val="20"/>
+        </w:rPr>
+        <w:t xml:space="preserve"> </w:t>
+      </w:r>
+      <w:r>
+        <w:rPr>
+          <w:rFonts w:asciiTheme="minorHAnsi" w:hAnsiTheme="minorHAnsi" w:cstheme="minorHAnsi"/>
+          <w:w w:val="105"/>
+          <w:sz w:val="20"/>
+        </w:rPr>
+        <w:t>Basics</w:t>
+      </w:r>
+      <w:r>
+        <w:rPr>
+          <w:rFonts w:asciiTheme="minorHAnsi" w:hAnsiTheme="minorHAnsi" w:cstheme="minorHAnsi"/>
+          <w:spacing w:val="17"/>
+          <w:w w:val="105"/>
+          <w:sz w:val="20"/>
+        </w:rPr>
+        <w:t xml:space="preserve"> </w:t>
+      </w:r>
+      <w:r>
+        <w:rPr>
+          <w:rFonts w:asciiTheme="minorHAnsi" w:hAnsiTheme="minorHAnsi" w:cstheme="minorHAnsi"/>
+          <w:w w:val="105"/>
+          <w:sz w:val="20"/>
+        </w:rPr>
+        <w:t>-</w:t>
+      </w:r>
+      <w:r>
+        <w:rPr>
+          <w:rFonts w:asciiTheme="minorHAnsi" w:hAnsiTheme="minorHAnsi" w:cstheme="minorHAnsi"/>
+          <w:spacing w:val="17"/>
+          <w:w w:val="105"/>
+          <w:sz w:val="20"/>
+        </w:rPr>
+        <w:t xml:space="preserve"> </w:t>
+      </w:r>
+      <w:r>
+        <w:rPr>
+          <w:rFonts w:asciiTheme="minorHAnsi" w:hAnsiTheme="minorHAnsi" w:cstheme="minorHAnsi"/>
+          <w:w w:val="105"/>
+          <w:sz w:val="20"/>
+        </w:rPr>
+        <w:t>IBM</w:t>
+      </w:r>
+      <w:r>
+        <w:rPr>
+          <w:rFonts w:asciiTheme="minorHAnsi" w:hAnsiTheme="minorHAnsi" w:cstheme="minorHAnsi"/>
+          <w:spacing w:val="17"/>
+          <w:w w:val="105"/>
+          <w:sz w:val="20"/>
+        </w:rPr>
+        <w:t xml:space="preserve"> </w:t>
+      </w:r>
+      <w:r>
+        <w:rPr>
+          <w:rFonts w:asciiTheme="minorHAnsi" w:hAnsiTheme="minorHAnsi" w:cstheme="minorHAnsi"/>
+          <w:spacing w:val="-2"/>
+          <w:w w:val="105"/>
+          <w:sz w:val="20"/>
+        </w:rPr>
+        <w:t>(Coursera)</w:t>
       </w:r>
     </w:p>
     <w:sectPr>
@@ -4799,6 +4349,7 @@
   <w:style w:type="character" w:default="1" w:styleId="DefaultParagraphFont">
     <w:name w:val="Default Paragraph Font"/>
     <w:uiPriority w:val="1"/>
+    <w:semiHidden/>
     <w:unhideWhenUsed/>
   </w:style>
   <w:style w:type="table" w:default="1" w:styleId="TableNormal">

</xml_diff>